<commit_message>
Added a lot lol
</commit_message>
<xml_diff>
--- a/latex/anhang/Doku und Notizen zum manuellen Selbstversuch.docx
+++ b/latex/anhang/Doku und Notizen zum manuellen Selbstversuch.docx
@@ -217,15 +217,7 @@
         <w:t>nie</w:t>
       </w:r>
       <w:r>
-        <w:t xml:space="preserve"> aufgerufen werden soll (da der Dummy nie klassifiziert wird). Das </w:t>
-      </w:r>
-      <w:proofErr w:type="gramStart"/>
-      <w:r>
-        <w:t>ist quasi</w:t>
-      </w:r>
-      <w:proofErr w:type="gramEnd"/>
-      <w:r>
-        <w:t xml:space="preserve"> historisch gewachsener "toter Code". Meine Entscheidung: Ich lasse Wert 1 komplett bei der Migration weg.</w:t>
+        <w:t xml:space="preserve"> aufgerufen werden soll (da der Dummy nie klassifiziert wird). Das ist quasi historisch gewachsener "toter Code". Meine Entscheidung: Ich lasse Wert 1 komplett bei der Migration weg.</w:t>
       </w:r>
     </w:p>
     <w:p>
@@ -243,15 +235,7 @@
         <w:t>Struktur-Entscheidung:</w:t>
       </w:r>
       <w:r>
-        <w:t xml:space="preserve"> Da Wert 0 keine Bedingung hat und Wert 1 gelöscht wird, verbleibt nur noch </w:t>
-      </w:r>
-      <w:proofErr w:type="gramStart"/>
-      <w:r>
-        <w:t>Wert</w:t>
-      </w:r>
-      <w:proofErr w:type="gramEnd"/>
-      <w:r>
-        <w:t xml:space="preserve"> 2 mit einer Bedingung. Da es nur ein einziger Wert ist, schreibe ich das als direkte Code-Zeile und schränke es nicht über eine extra Variantentabelle ein.</w:t>
+        <w:t xml:space="preserve"> Da Wert 0 keine Bedingung hat und Wert 1 gelöscht wird, verbleibt nur noch Wert 2 mit einer Bedingung. Da es nur ein einziger Wert ist, schreibe ich das als direkte Code-Zeile und schränke es nicht über eine extra Variantentabelle ein.</w:t>
       </w:r>
     </w:p>
     <w:p>
@@ -272,17 +256,12 @@
         <w:t xml:space="preserve"> Ich war mir anfangs unsicher, wie der genaue AVC-Code aussehen soll. Nach Blick in die Dokumentation lasse ich den alten INFERENCES-Block komplett weg, da AVC ohnehin alles herleitet. Auch den umständlichen OBJECTS-Block spare ich mir und referenziere die Merkmale direkt über das Präfix $</w:t>
       </w:r>
       <w:proofErr w:type="spellStart"/>
-      <w:proofErr w:type="gramStart"/>
       <w:r>
         <w:t>self</w:t>
       </w:r>
       <w:proofErr w:type="spellEnd"/>
       <w:r>
-        <w:t>..</w:t>
-      </w:r>
-      <w:proofErr w:type="gramEnd"/>
-      <w:r>
-        <w:t xml:space="preserve"> </w:t>
+        <w:t xml:space="preserve">.. </w:t>
       </w:r>
     </w:p>
     <w:p>
@@ -297,91 +276,210 @@
           <w:b/>
           <w:bCs/>
         </w:rPr>
-        <w:t xml:space="preserve">Mein erstellter </w:t>
-      </w:r>
-      <w:proofErr w:type="gramStart"/>
-      <w:r>
+        <w:t>Mein erstellter AVC Ziel-Code:</w:t>
+      </w:r>
+    </w:p>
+    <w:p>
+      <w:pPr>
+        <w:rPr>
+          <w:lang w:val="en-US"/>
+        </w:rPr>
+      </w:pPr>
+      <w:r>
+        <w:rPr>
+          <w:lang w:val="en-US"/>
+        </w:rPr>
+        <w:t>Code-Snippet</w:t>
+      </w:r>
+    </w:p>
+    <w:p>
+      <w:pPr>
+        <w:rPr>
+          <w:lang w:val="en-US"/>
+        </w:rPr>
+      </w:pPr>
+      <w:r>
+        <w:rPr>
+          <w:lang w:val="en-US"/>
+        </w:rPr>
+        <w:t>RESTRICTIONS:</w:t>
+      </w:r>
+    </w:p>
+    <w:p>
+      <w:pPr>
+        <w:rPr>
+          <w:lang w:val="en-US"/>
+        </w:rPr>
+      </w:pPr>
+      <w:r>
+        <w:rPr>
+          <w:lang w:val="en-US"/>
+        </w:rPr>
+        <w:t>$self.K40_BRM = '2' if $self.K40_fg_af = '1'.</w:t>
+      </w:r>
+    </w:p>
+    <w:p>
+      <w:pPr>
         <w:rPr>
           <w:b/>
           <w:bCs/>
         </w:rPr>
-        <w:t>AVC Ziel</w:t>
-      </w:r>
-      <w:proofErr w:type="gramEnd"/>
+      </w:pPr>
       <w:r>
         <w:rPr>
           <w:b/>
           <w:bCs/>
         </w:rPr>
-        <w:t>-Code:</w:t>
-      </w:r>
-    </w:p>
-    <w:p>
-      <w:pPr>
-        <w:rPr>
-          <w:lang w:val="en-US"/>
-        </w:rPr>
-      </w:pPr>
-      <w:r>
-        <w:rPr>
-          <w:lang w:val="en-US"/>
-        </w:rPr>
-        <w:t>Code-Snippet</w:t>
-      </w:r>
-    </w:p>
-    <w:p>
-      <w:pPr>
-        <w:rPr>
-          <w:lang w:val="en-US"/>
-        </w:rPr>
-      </w:pPr>
-      <w:r>
-        <w:rPr>
-          <w:lang w:val="en-US"/>
-        </w:rPr>
-        <w:t>RESTRICTIONS:</w:t>
-      </w:r>
-    </w:p>
-    <w:p>
-      <w:pPr>
-        <w:rPr>
-          <w:lang w:val="en-US"/>
-        </w:rPr>
-      </w:pPr>
-      <w:r>
-        <w:rPr>
-          <w:lang w:val="en-US"/>
-        </w:rPr>
-        <w:t>$</w:t>
-      </w:r>
-      <w:proofErr w:type="gramStart"/>
-      <w:r>
-        <w:rPr>
-          <w:lang w:val="en-US"/>
-        </w:rPr>
-        <w:t>self.K</w:t>
-      </w:r>
-      <w:proofErr w:type="gramEnd"/>
-      <w:r>
-        <w:rPr>
-          <w:lang w:val="en-US"/>
-        </w:rPr>
-        <w:t>40_BRM = '2' if $self.K40_fg_af = '1'.</w:t>
-      </w:r>
-    </w:p>
-    <w:p>
-      <w:pPr>
+        <w:t>Artefakt 2: K40_KO</w:t>
+      </w:r>
+    </w:p>
+    <w:p>
+      <w:pPr>
+        <w:numPr>
+          <w:ilvl w:val="0"/>
+          <w:numId w:val="2"/>
+        </w:numPr>
+      </w:pPr>
+      <w:r>
         <w:rPr>
           <w:b/>
           <w:bCs/>
         </w:rPr>
+        <w:t>Ausgangslage (LO-VC Input / Rohdaten):</w:t>
+      </w:r>
+    </w:p>
+    <w:p>
+      <w:pPr>
+        <w:numPr>
+          <w:ilvl w:val="1"/>
+          <w:numId w:val="2"/>
+        </w:numPr>
+      </w:pPr>
+      <w:r>
+        <w:t>Merkmalsname: K40_KO mit den Werten 01 bis 10 sowie 99.</w:t>
+      </w:r>
+    </w:p>
+    <w:p>
+      <w:pPr>
+        <w:numPr>
+          <w:ilvl w:val="1"/>
+          <w:numId w:val="2"/>
+        </w:numPr>
+      </w:pPr>
+      <w:r>
+        <w:lastRenderedPageBreak/>
+        <w:t>Viele Werte haben komplexe, teils redundante Vorbedingungen im JSON-Format hinterlegt.</w:t>
+      </w:r>
+    </w:p>
+    <w:p>
+      <w:pPr>
+        <w:numPr>
+          <w:ilvl w:val="0"/>
+          <w:numId w:val="2"/>
+        </w:numPr>
       </w:pPr>
       <w:r>
         <w:rPr>
           <w:b/>
           <w:bCs/>
         </w:rPr>
-        <w:t>Artefakt 2: K40_KO</w:t>
+        <w:t>Meine Analyse &amp; Gedankengänge bei der Migration:</w:t>
+      </w:r>
+    </w:p>
+    <w:p>
+      <w:pPr>
+        <w:numPr>
+          <w:ilvl w:val="1"/>
+          <w:numId w:val="2"/>
+        </w:numPr>
+      </w:pPr>
+      <w:r>
+        <w:rPr>
+          <w:i/>
+          <w:iCs/>
+        </w:rPr>
+        <w:t>Bereinigung toter Code:</w:t>
+      </w:r>
+      <w:r>
+        <w:t xml:space="preserve"> Die Werte 04, 06, 09 und 10 haben wieder die Vorbedingung </w:t>
+      </w:r>
+      <w:proofErr w:type="spellStart"/>
+      <w:r>
+        <w:t>specified</w:t>
+      </w:r>
+      <w:proofErr w:type="spellEnd"/>
+      <w:r>
+        <w:t xml:space="preserve"> </w:t>
+      </w:r>
+      <w:proofErr w:type="spellStart"/>
+      <w:r>
+        <w:t>dummy</w:t>
+      </w:r>
+      <w:proofErr w:type="spellEnd"/>
+      <w:r>
+        <w:t>. Diese ignoriere ich bei der Ziel-Generierung komplett.</w:t>
+      </w:r>
+    </w:p>
+    <w:p>
+      <w:pPr>
+        <w:numPr>
+          <w:ilvl w:val="1"/>
+          <w:numId w:val="2"/>
+        </w:numPr>
+      </w:pPr>
+      <w:r>
+        <w:rPr>
+          <w:i/>
+          <w:iCs/>
+        </w:rPr>
+        <w:t>Bereinigung Kommentare:</w:t>
+      </w:r>
+      <w:r>
+        <w:t xml:space="preserve"> Bei Wert 99 sind drei der vier Zeilen der Vorbedingung mit einem Stern (*) auskommentiert. Es verbleibt für diesen Wert also eigentlich nur eine echte, aktive Vorbedingung.</w:t>
+      </w:r>
+    </w:p>
+    <w:p>
+      <w:pPr>
+        <w:numPr>
+          <w:ilvl w:val="1"/>
+          <w:numId w:val="2"/>
+        </w:numPr>
+      </w:pPr>
+      <w:r>
+        <w:rPr>
+          <w:i/>
+          <w:iCs/>
+        </w:rPr>
+        <w:t>Mustererkennung &amp; Tabellenbildung:</w:t>
+      </w:r>
+      <w:r>
+        <w:t xml:space="preserve"> Mir fällt auf, dass sich die Werte 01, 02 und 03 exakt dieselbe Tabellen-Vorbedingung teilen. Das Gleiche gilt für die Werte 05 und 07. Wenn ich das alles als einzelne IF-Zuweisungen ausschreibe, wird der Code endlos lang. Ich entscheide mich, diese Cluster in zwei Variantentabellen zusammenzufassen.</w:t>
+      </w:r>
+    </w:p>
+    <w:p>
+      <w:pPr>
+        <w:numPr>
+          <w:ilvl w:val="1"/>
+          <w:numId w:val="2"/>
+        </w:numPr>
+      </w:pPr>
+      <w:r>
+        <w:rPr>
+          <w:i/>
+          <w:iCs/>
+        </w:rPr>
+        <w:t>Syntax-Update:</w:t>
+      </w:r>
+      <w:r>
+        <w:t xml:space="preserve"> Wert 08 hat eine sehr eigenständige Vorbedingung, in der ne (not </w:t>
+      </w:r>
+      <w:proofErr w:type="spellStart"/>
+      <w:r>
+        <w:t>equal</w:t>
+      </w:r>
+      <w:proofErr w:type="spellEnd"/>
+      <w:r>
+        <w:t xml:space="preserve">) vorkommt. Die korrekte Syntax hierfür in der modernen AVC-Engine ist &lt;&gt;. Das muss ich beim Schreiben ersetzen. </w:t>
       </w:r>
     </w:p>
     <w:p>
@@ -396,44 +494,324 @@
           <w:b/>
           <w:bCs/>
         </w:rPr>
-        <w:t>Ausgangslage (LO-VC Input / Rohdaten):</w:t>
-      </w:r>
-    </w:p>
-    <w:p>
-      <w:pPr>
-        <w:numPr>
-          <w:ilvl w:val="1"/>
-          <w:numId w:val="2"/>
-        </w:numPr>
-      </w:pPr>
-      <w:r>
-        <w:t>Merkmalsname: K40_KO mit den Werten 01 bis 10 sowie 99.</w:t>
-      </w:r>
-    </w:p>
-    <w:p>
-      <w:pPr>
-        <w:numPr>
-          <w:ilvl w:val="1"/>
-          <w:numId w:val="2"/>
-        </w:numPr>
-      </w:pPr>
-      <w:r>
+        <w:t>Mein erstellter AVC Ziel-Code:</w:t>
+      </w:r>
+    </w:p>
+    <w:p>
+      <w:pPr>
+        <w:rPr>
+          <w:lang w:val="en-US"/>
+        </w:rPr>
+      </w:pPr>
+      <w:r>
+        <w:rPr>
+          <w:lang w:val="en-US"/>
+        </w:rPr>
+        <w:t>Code-Snippet</w:t>
+      </w:r>
+    </w:p>
+    <w:p>
+      <w:pPr>
+        <w:rPr>
+          <w:lang w:val="en-US"/>
+        </w:rPr>
+      </w:pPr>
+      <w:r>
+        <w:rPr>
+          <w:lang w:val="en-US"/>
+        </w:rPr>
+        <w:t>RESTRICTIONS:</w:t>
+      </w:r>
+    </w:p>
+    <w:p>
+      <w:pPr>
+        <w:rPr>
+          <w:lang w:val="en-US"/>
+        </w:rPr>
+      </w:pPr>
+      <w:r>
+        <w:rPr>
+          <w:lang w:val="en-US"/>
+        </w:rPr>
+        <w:t>table K40_KO_01 (</w:t>
+      </w:r>
+    </w:p>
+    <w:p>
+      <w:pPr>
+        <w:rPr>
+          <w:lang w:val="en-US"/>
+        </w:rPr>
+      </w:pPr>
+      <w:r>
+        <w:rPr>
+          <w:lang w:val="en-US"/>
+        </w:rPr>
+        <w:t xml:space="preserve">    K40_fg_af = $self.K40_fg_af,</w:t>
+      </w:r>
+    </w:p>
+    <w:p>
+      <w:pPr>
+        <w:rPr>
+          <w:lang w:val="en-US"/>
+        </w:rPr>
+      </w:pPr>
+      <w:r>
+        <w:rPr>
+          <w:lang w:val="en-US"/>
+        </w:rPr>
+        <w:t xml:space="preserve">    K40_abl = $self.K40_abl,</w:t>
+      </w:r>
+    </w:p>
+    <w:p>
+      <w:r>
+        <w:rPr>
+          <w:lang w:val="en-US"/>
+        </w:rPr>
+        <w:t xml:space="preserve">    </w:t>
+      </w:r>
+      <w:r>
+        <w:t>K40_KO = $self.K40_KO</w:t>
+      </w:r>
+    </w:p>
+    <w:p>
+      <w:r>
+        <w:t>),</w:t>
+      </w:r>
+    </w:p>
+    <w:p>
+      <w:pPr>
+        <w:rPr>
+          <w:lang w:val="en-US"/>
+        </w:rPr>
+      </w:pPr>
+      <w:r>
+        <w:rPr>
+          <w:lang w:val="en-US"/>
+        </w:rPr>
+        <w:t>table K40_KO_02 (</w:t>
+      </w:r>
+    </w:p>
+    <w:p>
+      <w:pPr>
+        <w:rPr>
+          <w:lang w:val="en-US"/>
+        </w:rPr>
+      </w:pPr>
+      <w:r>
+        <w:rPr>
+          <w:lang w:val="en-US"/>
+        </w:rPr>
+        <w:t xml:space="preserve">    K40_fg_af = $self.K40_fg_af,</w:t>
+      </w:r>
+    </w:p>
+    <w:p>
+      <w:pPr>
+        <w:rPr>
+          <w:lang w:val="en-US"/>
+        </w:rPr>
+      </w:pPr>
+      <w:r>
+        <w:rPr>
+          <w:lang w:val="en-US"/>
+        </w:rPr>
+        <w:t xml:space="preserve">    K40_ts = $self.K40_ts,</w:t>
+      </w:r>
+    </w:p>
+    <w:p>
+      <w:r>
+        <w:rPr>
+          <w:lang w:val="en-US"/>
+        </w:rPr>
+        <w:t xml:space="preserve">    </w:t>
+      </w:r>
+      <w:r>
+        <w:t>K40_KO = $self.K40_KO</w:t>
+      </w:r>
+    </w:p>
+    <w:p>
+      <w:r>
+        <w:t>),</w:t>
+      </w:r>
+    </w:p>
+    <w:p>
+      <w:pPr>
+        <w:rPr>
+          <w:lang w:val="en-US"/>
+        </w:rPr>
+      </w:pPr>
+      <w:r>
+        <w:rPr>
+          <w:lang w:val="en-US"/>
+        </w:rPr>
+        <w:t xml:space="preserve">$self.K40_KO = '08' if ($self.K40_fg_af = '3' or $self.K40_fg_af = '4') </w:t>
+      </w:r>
+    </w:p>
+    <w:p>
+      <w:pPr>
+        <w:rPr>
+          <w:lang w:val="en-US"/>
+        </w:rPr>
+      </w:pPr>
+      <w:r>
+        <w:rPr>
+          <w:lang w:val="en-US"/>
+        </w:rPr>
+        <w:t xml:space="preserve">    and $self.K40_brm = '0' and $self.K40_ts &lt;&gt; '1',</w:t>
+      </w:r>
+    </w:p>
+    <w:p>
+      <w:pPr>
+        <w:rPr>
+          <w:lang w:val="en-US"/>
+        </w:rPr>
+      </w:pPr>
+      <w:r>
+        <w:rPr>
+          <w:lang w:val="en-US"/>
+        </w:rPr>
         <w:lastRenderedPageBreak/>
-        <w:t>Viele Werte haben komplexe, teils redundante Vorbedingungen im JSON-Format hinterlegt.</w:t>
-      </w:r>
-    </w:p>
-    <w:p>
-      <w:pPr>
-        <w:numPr>
-          <w:ilvl w:val="0"/>
-          <w:numId w:val="2"/>
-        </w:numPr>
-      </w:pPr>
-      <w:r>
+        <w:t>$self.K40_KO = '99' if $self.K40_pl in ('d1','h1','h2').</w:t>
+      </w:r>
+    </w:p>
+    <w:p>
+      <w:pPr>
+        <w:rPr>
+          <w:lang w:val="en-US"/>
+        </w:rPr>
+      </w:pPr>
+    </w:p>
+    <w:p>
+      <w:pPr>
         <w:rPr>
           <w:b/>
           <w:bCs/>
         </w:rPr>
+      </w:pPr>
+      <w:r>
+        <w:rPr>
+          <w:b/>
+          <w:bCs/>
+        </w:rPr>
+        <w:t>Artefakt 3: K40_PL</w:t>
+      </w:r>
+    </w:p>
+    <w:p>
+      <w:pPr>
+        <w:numPr>
+          <w:ilvl w:val="0"/>
+          <w:numId w:val="3"/>
+        </w:numPr>
+      </w:pPr>
+      <w:r>
+        <w:rPr>
+          <w:b/>
+          <w:bCs/>
+        </w:rPr>
+        <w:t>Ausgangslage (LO-VC Input / Rohdaten):</w:t>
+      </w:r>
+    </w:p>
+    <w:p>
+      <w:pPr>
+        <w:numPr>
+          <w:ilvl w:val="1"/>
+          <w:numId w:val="3"/>
+        </w:numPr>
+      </w:pPr>
+      <w:r>
+        <w:t>Merkmalsname: K40_PL (Char).</w:t>
+      </w:r>
+    </w:p>
+    <w:p>
+      <w:pPr>
+        <w:numPr>
+          <w:ilvl w:val="1"/>
+          <w:numId w:val="3"/>
+        </w:numPr>
+      </w:pPr>
+      <w:r>
+        <w:t>Zugeordnete Werte: H2, H3, H5, D1, H1, H4, D2.</w:t>
+      </w:r>
+    </w:p>
+    <w:p>
+      <w:pPr>
+        <w:numPr>
+          <w:ilvl w:val="1"/>
+          <w:numId w:val="3"/>
+        </w:numPr>
+      </w:pPr>
+      <w:r>
+        <w:t xml:space="preserve">Werte H2, H3 und H5 enthalten alle die Bedingung </w:t>
+      </w:r>
+      <w:proofErr w:type="spellStart"/>
+      <w:r>
+        <w:t>specified</w:t>
+      </w:r>
+      <w:proofErr w:type="spellEnd"/>
+      <w:r>
+        <w:t xml:space="preserve"> </w:t>
+      </w:r>
+      <w:proofErr w:type="spellStart"/>
+      <w:r>
+        <w:t>dummy</w:t>
+      </w:r>
+      <w:proofErr w:type="spellEnd"/>
+      <w:r>
+        <w:t>. Bei H2 steht diese in Kombination mit einer weiteren Bedingung (K40_fst = '0').</w:t>
+      </w:r>
+    </w:p>
+    <w:p>
+      <w:pPr>
+        <w:numPr>
+          <w:ilvl w:val="1"/>
+          <w:numId w:val="3"/>
+        </w:numPr>
+      </w:pPr>
+      <w:r>
+        <w:t>Werte D1 und H1 haben beide exakt dieselbe Bedingung: K40_fst = '0'.</w:t>
+      </w:r>
+    </w:p>
+    <w:p>
+      <w:pPr>
+        <w:numPr>
+          <w:ilvl w:val="1"/>
+          <w:numId w:val="3"/>
+        </w:numPr>
+      </w:pPr>
+      <w:r>
+        <w:t xml:space="preserve">Wert H4 hat die Bedingung: </w:t>
+      </w:r>
+      <w:proofErr w:type="spellStart"/>
+      <w:r>
+        <w:t>Specified</w:t>
+      </w:r>
+      <w:proofErr w:type="spellEnd"/>
+      <w:r>
+        <w:t xml:space="preserve"> K40_FG_AF and K40_FG_AF = '4'.</w:t>
+      </w:r>
+    </w:p>
+    <w:p>
+      <w:pPr>
+        <w:numPr>
+          <w:ilvl w:val="1"/>
+          <w:numId w:val="3"/>
+        </w:numPr>
+      </w:pPr>
+      <w:r>
+        <w:t>Wert D2 hat keine Vorbedingungen.</w:t>
+      </w:r>
+    </w:p>
+    <w:p>
+      <w:pPr>
+        <w:numPr>
+          <w:ilvl w:val="0"/>
+          <w:numId w:val="3"/>
+        </w:numPr>
+      </w:pPr>
+      <w:r>
+        <w:rPr>
+          <w:b/>
+          <w:bCs/>
+        </w:rPr>
         <w:t>Meine Analyse &amp; Gedankengänge bei der Migration:</w:t>
       </w:r>
     </w:p>
@@ -441,7 +819,7 @@
       <w:pPr>
         <w:numPr>
           <w:ilvl w:val="1"/>
-          <w:numId w:val="2"/>
+          <w:numId w:val="3"/>
         </w:numPr>
       </w:pPr>
       <w:r>
@@ -449,10 +827,10 @@
           <w:i/>
           <w:iCs/>
         </w:rPr>
-        <w:t>Bereinigung toter Code:</w:t>
-      </w:r>
-      <w:r>
-        <w:t xml:space="preserve"> Die Werte 04, 06, 09 und 10 haben wieder die Vorbedingung </w:t>
+        <w:t>Umgang mit Dummy-Werten:</w:t>
+      </w:r>
+      <w:r>
+        <w:t xml:space="preserve"> Auch hier taucht das Anti-Pattern </w:t>
       </w:r>
       <w:proofErr w:type="spellStart"/>
       <w:r>
@@ -468,14 +846,14 @@
       </w:r>
       <w:proofErr w:type="spellEnd"/>
       <w:r>
-        <w:t>. Diese ignoriere ich bei der Ziel-Generierung komplett.</w:t>
+        <w:t xml:space="preserve"> wieder auf. Die Werte H3 und H5 fliegen direkt raus. Interessant ist H2: Hier gibt es noch eine zweite Vorbedingung. Da Vorbedingungen bei Werten aber logisch mit AND verknüpft werden, zieht der Dummy den kompletten Wert mit runter. Ich lösche H2 also ebenfalls komplett aus der Ziel-Architektur.</w:t>
       </w:r>
     </w:p>
     <w:p>
       <w:pPr>
         <w:numPr>
           <w:ilvl w:val="1"/>
-          <w:numId w:val="2"/>
+          <w:numId w:val="3"/>
         </w:numPr>
       </w:pPr>
       <w:r>
@@ -483,17 +861,33 @@
           <w:i/>
           <w:iCs/>
         </w:rPr>
-        <w:t>Bereinigung Kommentare:</w:t>
-      </w:r>
-      <w:r>
-        <w:t xml:space="preserve"> Bei Wert 99 sind drei der vier Zeilen der Vorbedingung mit einem Stern (*) auskommentiert. Es verbleibt für diesen Wert also eigentlich nur eine echte, aktive Vorbedingung.</w:t>
+        <w:t>Redundanz-Bereinigung:</w:t>
+      </w:r>
+      <w:r>
+        <w:t xml:space="preserve"> Bei Wert H4 steht </w:t>
+      </w:r>
+      <w:proofErr w:type="spellStart"/>
+      <w:r>
+        <w:t>Specified</w:t>
+      </w:r>
+      <w:proofErr w:type="spellEnd"/>
+      <w:r>
+        <w:t xml:space="preserve"> K40_FG_AF and K40_FG_AF = '4'. Das ist logisch betrachtet "doppelt gemoppelt". Wenn ein Merkmal den Wert '4' hat, ist es automatisch auch spezifiziert. Ich entscheide mich, diesen alten Ballast abzuwerfen und den AVC-Code schlanker zu machen, indem ich das </w:t>
+      </w:r>
+      <w:proofErr w:type="spellStart"/>
+      <w:r>
+        <w:t>Specified</w:t>
+      </w:r>
+      <w:proofErr w:type="spellEnd"/>
+      <w:r>
+        <w:t xml:space="preserve"> einfach weglasse.</w:t>
       </w:r>
     </w:p>
     <w:p>
       <w:pPr>
         <w:numPr>
           <w:ilvl w:val="1"/>
-          <w:numId w:val="2"/>
+          <w:numId w:val="3"/>
         </w:numPr>
       </w:pPr>
       <w:r>
@@ -504,14 +898,14 @@
         <w:t>Mustererkennung &amp; Tabellenbildung:</w:t>
       </w:r>
       <w:r>
-        <w:t xml:space="preserve"> Mir fällt auf, dass sich die Werte 01, 02 und 03 exakt dieselbe Tabellen-Vorbedingung teilen. Das Gleiche gilt für die Werte 05 und 07. Wenn ich das alles als einzelne IF-Zuweisungen ausschreibe, wird der Code endlos lang. Ich entscheide mich, diese Cluster in zwei Variantentabellen zusammenzufassen.</w:t>
+        <w:t xml:space="preserve"> Die Werte D1 und H1 teilen sich wieder exakt dieselbe Bedingung (K40_fst = '0'). Um den Code elegant zu halten und die Engine nicht mit IF-Statements zu überladen, packe ich diese beiden Werte in eine kleine Variantentabelle.</w:t>
       </w:r>
     </w:p>
     <w:p>
       <w:pPr>
         <w:numPr>
           <w:ilvl w:val="1"/>
-          <w:numId w:val="2"/>
+          <w:numId w:val="3"/>
         </w:numPr>
       </w:pPr>
       <w:r>
@@ -519,25 +913,17 @@
           <w:i/>
           <w:iCs/>
         </w:rPr>
-        <w:t>Syntax-Update:</w:t>
-      </w:r>
-      <w:r>
-        <w:t xml:space="preserve"> Wert 08 hat eine sehr eigenständige Vorbedingung, in der ne (not </w:t>
-      </w:r>
-      <w:proofErr w:type="spellStart"/>
-      <w:r>
-        <w:t>equal</w:t>
-      </w:r>
-      <w:proofErr w:type="spellEnd"/>
-      <w:r>
-        <w:t xml:space="preserve">) vorkommt. Die korrekte Syntax hierfür in der modernen AVC-Engine ist &lt;&gt;. Das muss ich beim Schreiben ersetzen. </w:t>
+        <w:t>Wert ohne Bedingung:</w:t>
+      </w:r>
+      <w:r>
+        <w:t xml:space="preserve"> Da D2 keine Bedingung hat, muss ich dafür keinen Code generieren. Er ist einfach immer erlaubt.</w:t>
       </w:r>
     </w:p>
     <w:p>
       <w:pPr>
         <w:numPr>
           <w:ilvl w:val="0"/>
-          <w:numId w:val="2"/>
+          <w:numId w:val="3"/>
         </w:numPr>
       </w:pPr>
       <w:r>
@@ -545,321 +931,152 @@
           <w:b/>
           <w:bCs/>
         </w:rPr>
-        <w:t xml:space="preserve">Mein erstellter </w:t>
-      </w:r>
-      <w:proofErr w:type="gramStart"/>
+        <w:t>Mein erstellter AVC Ziel-Code:</w:t>
+      </w:r>
+    </w:p>
+    <w:p>
+      <w:pPr>
+        <w:rPr>
+          <w:lang w:val="en-US"/>
+        </w:rPr>
+      </w:pPr>
+      <w:r>
+        <w:rPr>
+          <w:lang w:val="en-US"/>
+        </w:rPr>
+        <w:t>Code-Snippet</w:t>
+      </w:r>
+    </w:p>
+    <w:p>
+      <w:pPr>
+        <w:rPr>
+          <w:lang w:val="en-US"/>
+        </w:rPr>
+      </w:pPr>
+      <w:r>
+        <w:rPr>
+          <w:lang w:val="en-US"/>
+        </w:rPr>
+        <w:t>RESTRICTIONS:</w:t>
+      </w:r>
+    </w:p>
+    <w:p>
+      <w:pPr>
+        <w:rPr>
+          <w:lang w:val="en-US"/>
+        </w:rPr>
+      </w:pPr>
+      <w:r>
+        <w:rPr>
+          <w:lang w:val="en-US"/>
+        </w:rPr>
+        <w:t>table K40_PL_01 (</w:t>
+      </w:r>
+    </w:p>
+    <w:p>
+      <w:pPr>
+        <w:rPr>
+          <w:lang w:val="en-US"/>
+        </w:rPr>
+      </w:pPr>
+      <w:r>
+        <w:rPr>
+          <w:lang w:val="en-US"/>
+        </w:rPr>
+        <w:lastRenderedPageBreak/>
+        <w:t xml:space="preserve">    K40_fst = $self.K40_fst,</w:t>
+      </w:r>
+    </w:p>
+    <w:p>
+      <w:pPr>
+        <w:rPr>
+          <w:lang w:val="en-US"/>
+        </w:rPr>
+      </w:pPr>
+      <w:r>
+        <w:rPr>
+          <w:lang w:val="en-US"/>
+        </w:rPr>
+        <w:t xml:space="preserve">    K40_PL = $self.K40_PL</w:t>
+      </w:r>
+    </w:p>
+    <w:p>
+      <w:pPr>
+        <w:rPr>
+          <w:lang w:val="en-US"/>
+        </w:rPr>
+      </w:pPr>
+      <w:r>
+        <w:rPr>
+          <w:lang w:val="en-US"/>
+        </w:rPr>
+        <w:t>),</w:t>
+      </w:r>
+    </w:p>
+    <w:p>
+      <w:pPr>
+        <w:rPr>
+          <w:lang w:val="en-US"/>
+        </w:rPr>
+      </w:pPr>
+      <w:r>
+        <w:rPr>
+          <w:lang w:val="en-US"/>
+        </w:rPr>
+        <w:t>$self.K40_PL = 'H4' if $self.K40_FG_AF = '4'.</w:t>
+      </w:r>
+    </w:p>
+    <w:p>
+      <w:pPr>
+        <w:numPr>
+          <w:ilvl w:val="0"/>
+          <w:numId w:val="3"/>
+        </w:numPr>
+      </w:pPr>
       <w:r>
         <w:rPr>
           <w:b/>
           <w:bCs/>
         </w:rPr>
-        <w:t>AVC Ziel</w:t>
-      </w:r>
-      <w:proofErr w:type="gramEnd"/>
+        <w:t>Meine Tabellen hierzu:</w:t>
+      </w:r>
+    </w:p>
+    <w:p>
+      <w:pPr>
+        <w:numPr>
+          <w:ilvl w:val="1"/>
+          <w:numId w:val="3"/>
+        </w:numPr>
+      </w:pPr>
       <w:r>
         <w:rPr>
           <w:b/>
           <w:bCs/>
         </w:rPr>
-        <w:t>-Code:</w:t>
-      </w:r>
-    </w:p>
-    <w:p>
-      <w:pPr>
-        <w:rPr>
-          <w:lang w:val="en-US"/>
-        </w:rPr>
-      </w:pPr>
-      <w:r>
-        <w:rPr>
-          <w:lang w:val="en-US"/>
-        </w:rPr>
-        <w:t>Code-Snippet</w:t>
-      </w:r>
-    </w:p>
-    <w:p>
-      <w:pPr>
-        <w:rPr>
-          <w:lang w:val="en-US"/>
-        </w:rPr>
-      </w:pPr>
-      <w:r>
-        <w:rPr>
-          <w:lang w:val="en-US"/>
-        </w:rPr>
-        <w:t>RESTRICTIONS:</w:t>
-      </w:r>
-    </w:p>
-    <w:p>
-      <w:pPr>
-        <w:rPr>
-          <w:lang w:val="en-US"/>
-        </w:rPr>
-      </w:pPr>
-      <w:r>
-        <w:rPr>
-          <w:lang w:val="en-US"/>
-        </w:rPr>
-        <w:t>table K40_KO_01 (</w:t>
-      </w:r>
-    </w:p>
-    <w:p>
-      <w:pPr>
-        <w:rPr>
-          <w:lang w:val="en-US"/>
-        </w:rPr>
-      </w:pPr>
-      <w:r>
-        <w:rPr>
-          <w:lang w:val="en-US"/>
-        </w:rPr>
-        <w:t xml:space="preserve">    K40_fg_af = $</w:t>
-      </w:r>
-      <w:proofErr w:type="gramStart"/>
-      <w:r>
-        <w:rPr>
-          <w:lang w:val="en-US"/>
-        </w:rPr>
-        <w:t>self.K</w:t>
-      </w:r>
-      <w:proofErr w:type="gramEnd"/>
-      <w:r>
-        <w:rPr>
-          <w:lang w:val="en-US"/>
-        </w:rPr>
-        <w:t>40_fg_af,</w:t>
-      </w:r>
-    </w:p>
-    <w:p>
-      <w:pPr>
-        <w:rPr>
-          <w:lang w:val="en-US"/>
-        </w:rPr>
-      </w:pPr>
-      <w:r>
-        <w:rPr>
-          <w:lang w:val="en-US"/>
-        </w:rPr>
-        <w:t xml:space="preserve">    K40_abl = $</w:t>
-      </w:r>
-      <w:proofErr w:type="gramStart"/>
-      <w:r>
-        <w:rPr>
-          <w:lang w:val="en-US"/>
-        </w:rPr>
-        <w:t>self.K</w:t>
-      </w:r>
-      <w:proofErr w:type="gramEnd"/>
-      <w:r>
-        <w:rPr>
-          <w:lang w:val="en-US"/>
-        </w:rPr>
-        <w:t>40_abl,</w:t>
-      </w:r>
-    </w:p>
-    <w:p>
-      <w:r>
-        <w:rPr>
-          <w:lang w:val="en-US"/>
-        </w:rPr>
-        <w:t xml:space="preserve">    </w:t>
-      </w:r>
-      <w:r>
-        <w:t>K40_KO = $</w:t>
-      </w:r>
-      <w:proofErr w:type="gramStart"/>
-      <w:r>
-        <w:t>self.K</w:t>
-      </w:r>
-      <w:proofErr w:type="gramEnd"/>
-      <w:r>
-        <w:t>40_KO</w:t>
-      </w:r>
-    </w:p>
-    <w:p>
-      <w:r>
-        <w:t>),</w:t>
-      </w:r>
-    </w:p>
-    <w:p>
-      <w:pPr>
-        <w:rPr>
-          <w:lang w:val="en-US"/>
-        </w:rPr>
-      </w:pPr>
-      <w:r>
-        <w:rPr>
-          <w:lang w:val="en-US"/>
-        </w:rPr>
-        <w:t>table K40_KO_02 (</w:t>
-      </w:r>
-    </w:p>
-    <w:p>
-      <w:pPr>
-        <w:rPr>
-          <w:lang w:val="en-US"/>
-        </w:rPr>
-      </w:pPr>
-      <w:r>
-        <w:rPr>
-          <w:lang w:val="en-US"/>
-        </w:rPr>
-        <w:t xml:space="preserve">    K40_fg_af = $</w:t>
-      </w:r>
-      <w:proofErr w:type="gramStart"/>
-      <w:r>
-        <w:rPr>
-          <w:lang w:val="en-US"/>
-        </w:rPr>
-        <w:t>self.K</w:t>
-      </w:r>
-      <w:proofErr w:type="gramEnd"/>
-      <w:r>
-        <w:rPr>
-          <w:lang w:val="en-US"/>
-        </w:rPr>
-        <w:t>40_fg_af,</w:t>
-      </w:r>
-    </w:p>
-    <w:p>
-      <w:pPr>
-        <w:rPr>
-          <w:lang w:val="en-US"/>
-        </w:rPr>
-      </w:pPr>
-      <w:r>
-        <w:rPr>
-          <w:lang w:val="en-US"/>
-        </w:rPr>
-        <w:t xml:space="preserve">    K40_ts = $</w:t>
-      </w:r>
-      <w:proofErr w:type="gramStart"/>
-      <w:r>
-        <w:rPr>
-          <w:lang w:val="en-US"/>
-        </w:rPr>
-        <w:t>self.K</w:t>
-      </w:r>
-      <w:proofErr w:type="gramEnd"/>
-      <w:r>
-        <w:rPr>
-          <w:lang w:val="en-US"/>
-        </w:rPr>
-        <w:t>40_ts,</w:t>
-      </w:r>
-    </w:p>
-    <w:p>
-      <w:r>
-        <w:rPr>
-          <w:lang w:val="en-US"/>
-        </w:rPr>
-        <w:t xml:space="preserve">    </w:t>
-      </w:r>
-      <w:r>
-        <w:t>K40_KO = $</w:t>
-      </w:r>
-      <w:proofErr w:type="gramStart"/>
-      <w:r>
-        <w:t>self.K</w:t>
-      </w:r>
-      <w:proofErr w:type="gramEnd"/>
-      <w:r>
-        <w:t>40_KO</w:t>
-      </w:r>
-    </w:p>
-    <w:p>
-      <w:r>
-        <w:t>),</w:t>
-      </w:r>
-    </w:p>
-    <w:p>
-      <w:pPr>
-        <w:rPr>
-          <w:lang w:val="en-US"/>
-        </w:rPr>
-      </w:pPr>
-      <w:r>
-        <w:rPr>
-          <w:lang w:val="en-US"/>
-        </w:rPr>
-        <w:t>$</w:t>
-      </w:r>
-      <w:proofErr w:type="gramStart"/>
-      <w:r>
-        <w:rPr>
-          <w:lang w:val="en-US"/>
-        </w:rPr>
-        <w:t>self.K</w:t>
-      </w:r>
-      <w:proofErr w:type="gramEnd"/>
-      <w:r>
-        <w:rPr>
-          <w:lang w:val="en-US"/>
-        </w:rPr>
-        <w:t xml:space="preserve">40_KO = '08' if ($self.K40_fg_af = '3' or $self.K40_fg_af = '4') </w:t>
-      </w:r>
-    </w:p>
-    <w:p>
-      <w:pPr>
-        <w:rPr>
-          <w:lang w:val="en-US"/>
-        </w:rPr>
-      </w:pPr>
-      <w:r>
-        <w:rPr>
-          <w:lang w:val="en-US"/>
-        </w:rPr>
-        <w:t xml:space="preserve">    and $</w:t>
-      </w:r>
-      <w:proofErr w:type="gramStart"/>
-      <w:r>
-        <w:rPr>
-          <w:lang w:val="en-US"/>
-        </w:rPr>
-        <w:t>self.K</w:t>
-      </w:r>
-      <w:proofErr w:type="gramEnd"/>
-      <w:r>
-        <w:rPr>
-          <w:lang w:val="en-US"/>
-        </w:rPr>
-        <w:t>40_brm = '0' and $self.K40_ts &lt;&gt; '1',</w:t>
-      </w:r>
-    </w:p>
-    <w:p>
-      <w:pPr>
-        <w:rPr>
-          <w:lang w:val="en-US"/>
-        </w:rPr>
-      </w:pPr>
-      <w:r>
-        <w:rPr>
-          <w:lang w:val="en-US"/>
-        </w:rPr>
-        <w:lastRenderedPageBreak/>
-        <w:t>$</w:t>
-      </w:r>
-      <w:proofErr w:type="gramStart"/>
-      <w:r>
-        <w:rPr>
-          <w:lang w:val="en-US"/>
-        </w:rPr>
-        <w:t>self.K</w:t>
-      </w:r>
-      <w:proofErr w:type="gramEnd"/>
-      <w:r>
-        <w:rPr>
-          <w:lang w:val="en-US"/>
-        </w:rPr>
-        <w:t>40_KO = '99' if $self.K40_pl in ('d1','h1','h2').</w:t>
-      </w:r>
-    </w:p>
-    <w:p>
-      <w:pPr>
-        <w:rPr>
-          <w:lang w:val="en-US"/>
-        </w:rPr>
-      </w:pPr>
+        <w:t>Tabelle 1 (K40_PL_01):</w:t>
+      </w:r>
+    </w:p>
+    <w:p>
+      <w:pPr>
+        <w:numPr>
+          <w:ilvl w:val="2"/>
+          <w:numId w:val="3"/>
+        </w:numPr>
+      </w:pPr>
+      <w:r>
+        <w:t>Spalten: K40_fst, K40_PL</w:t>
+      </w:r>
+    </w:p>
+    <w:p>
+      <w:pPr>
+        <w:numPr>
+          <w:ilvl w:val="2"/>
+          <w:numId w:val="3"/>
+        </w:numPr>
+      </w:pPr>
+      <w:r>
+        <w:t>Zeilen: 0, D1; 0, H1</w:t>
+      </w:r>
     </w:p>
     <w:p>
       <w:pPr>
@@ -873,14 +1090,14 @@
           <w:b/>
           <w:bCs/>
         </w:rPr>
-        <w:t>Artefakt 3: K40_PL</w:t>
+        <w:t>Artefakt 4: K40_SCHP</w:t>
       </w:r>
     </w:p>
     <w:p>
       <w:pPr>
         <w:numPr>
           <w:ilvl w:val="0"/>
-          <w:numId w:val="3"/>
+          <w:numId w:val="4"/>
         </w:numPr>
       </w:pPr>
       <w:r>
@@ -895,33 +1112,33 @@
       <w:pPr>
         <w:numPr>
           <w:ilvl w:val="1"/>
-          <w:numId w:val="3"/>
-        </w:numPr>
-      </w:pPr>
-      <w:r>
-        <w:t>Merkmalsname: K40_PL (Char).</w:t>
+          <w:numId w:val="4"/>
+        </w:numPr>
+      </w:pPr>
+      <w:r>
+        <w:t>Merkmalsname: K40_SCHP (Char) mit den Werten 01 bis 10.</w:t>
       </w:r>
     </w:p>
     <w:p>
       <w:pPr>
         <w:numPr>
           <w:ilvl w:val="1"/>
-          <w:numId w:val="3"/>
-        </w:numPr>
-      </w:pPr>
-      <w:r>
-        <w:t>Zugeordnete Werte: H2, H3, H5, D1, H1, H4, D2.</w:t>
-      </w:r>
-    </w:p>
-    <w:p>
-      <w:pPr>
-        <w:numPr>
-          <w:ilvl w:val="1"/>
-          <w:numId w:val="3"/>
-        </w:numPr>
-      </w:pPr>
-      <w:r>
-        <w:t xml:space="preserve">Werte H2, H3 und H5 enthalten alle die Bedingung </w:t>
+          <w:numId w:val="4"/>
+        </w:numPr>
+      </w:pPr>
+      <w:r>
+        <w:t>Besonderheiten bei den Vorbedingungen:</w:t>
+      </w:r>
+    </w:p>
+    <w:p>
+      <w:pPr>
+        <w:numPr>
+          <w:ilvl w:val="2"/>
+          <w:numId w:val="4"/>
+        </w:numPr>
+      </w:pPr>
+      <w:r>
+        <w:t xml:space="preserve">Wert 02: Enthält einen großen Block an auskommentiertem Freitext (z. B. *Merkmalswert ausgeblendet) und nur eine aktive Zeile (not </w:t>
       </w:r>
       <w:proofErr w:type="spellStart"/>
       <w:r>
@@ -929,63 +1146,58 @@
       </w:r>
       <w:proofErr w:type="spellEnd"/>
       <w:r>
-        <w:t xml:space="preserve"> </w:t>
-      </w:r>
-      <w:proofErr w:type="spellStart"/>
-      <w:r>
-        <w:t>dummy</w:t>
-      </w:r>
-      <w:proofErr w:type="spellEnd"/>
-      <w:r>
-        <w:t>. Bei H2 steht diese in Kombination mit einer weiteren Bedingung (K40_fst = '0').</w:t>
-      </w:r>
-    </w:p>
-    <w:p>
-      <w:pPr>
-        <w:numPr>
-          <w:ilvl w:val="1"/>
-          <w:numId w:val="3"/>
-        </w:numPr>
-      </w:pPr>
-      <w:r>
-        <w:t>Werte D1 und H1 haben beide exakt dieselbe Bedingung: K40_fst = '0'.</w:t>
-      </w:r>
-    </w:p>
-    <w:p>
-      <w:pPr>
-        <w:numPr>
-          <w:ilvl w:val="1"/>
-          <w:numId w:val="3"/>
-        </w:numPr>
-      </w:pPr>
-      <w:r>
-        <w:t xml:space="preserve">Wert H4 hat die Bedingung: </w:t>
-      </w:r>
-      <w:proofErr w:type="spellStart"/>
-      <w:r>
-        <w:t>Specified</w:t>
-      </w:r>
-      <w:proofErr w:type="spellEnd"/>
-      <w:r>
-        <w:t xml:space="preserve"> K40_FG_AF and K40_FG_AF = '4'.</w:t>
-      </w:r>
-    </w:p>
-    <w:p>
-      <w:pPr>
-        <w:numPr>
-          <w:ilvl w:val="1"/>
-          <w:numId w:val="3"/>
-        </w:numPr>
-      </w:pPr>
-      <w:r>
-        <w:t>Wert D2 hat keine Vorbedingungen.</w:t>
+        <w:t xml:space="preserve"> K40_FG_AF).</w:t>
+      </w:r>
+    </w:p>
+    <w:p>
+      <w:pPr>
+        <w:numPr>
+          <w:ilvl w:val="2"/>
+          <w:numId w:val="4"/>
+        </w:numPr>
+      </w:pPr>
+      <w:r>
+        <w:t>Werte 01 und 10: Haben exakt dieselbe Bedingung (K40_ko_af = '1' and K40_ps ne 'pw04' and K40_ps ne 'ps03').</w:t>
+      </w:r>
+    </w:p>
+    <w:p>
+      <w:pPr>
+        <w:numPr>
+          <w:ilvl w:val="2"/>
+          <w:numId w:val="4"/>
+        </w:numPr>
+      </w:pPr>
+      <w:r>
+        <w:t>Werte 07 und 08: Haben exakt dieselbe Bedingung (K40_ko_af = '2' and K40_fg_af in ('3','4') and K40_ko ne '07').</w:t>
+      </w:r>
+    </w:p>
+    <w:p>
+      <w:pPr>
+        <w:numPr>
+          <w:ilvl w:val="2"/>
+          <w:numId w:val="4"/>
+        </w:numPr>
+      </w:pPr>
+      <w:r>
+        <w:t>Werte 03 und 09: Haben exakt dieselbe Bedingung (K40_ko = '08' and K40_abl = '0').</w:t>
+      </w:r>
+    </w:p>
+    <w:p>
+      <w:pPr>
+        <w:numPr>
+          <w:ilvl w:val="2"/>
+          <w:numId w:val="4"/>
+        </w:numPr>
+      </w:pPr>
+      <w:r>
+        <w:t>Wert 05: Ähnelt 03/09, prüft aber auf K40_ko = '09'.</w:t>
       </w:r>
     </w:p>
     <w:p>
       <w:pPr>
         <w:numPr>
           <w:ilvl w:val="0"/>
-          <w:numId w:val="3"/>
+          <w:numId w:val="4"/>
         </w:numPr>
       </w:pPr>
       <w:r>
@@ -1000,7 +1212,7 @@
       <w:pPr>
         <w:numPr>
           <w:ilvl w:val="1"/>
-          <w:numId w:val="3"/>
+          <w:numId w:val="4"/>
         </w:numPr>
       </w:pPr>
       <w:r>
@@ -1008,33 +1220,17 @@
           <w:i/>
           <w:iCs/>
         </w:rPr>
-        <w:t>Umgang mit Dummy-Werten:</w:t>
-      </w:r>
-      <w:r>
-        <w:t xml:space="preserve"> Auch hier taucht das Anti-Pattern </w:t>
-      </w:r>
-      <w:proofErr w:type="spellStart"/>
-      <w:r>
-        <w:t>specified</w:t>
-      </w:r>
-      <w:proofErr w:type="spellEnd"/>
-      <w:r>
-        <w:t xml:space="preserve"> </w:t>
-      </w:r>
-      <w:proofErr w:type="spellStart"/>
-      <w:r>
-        <w:t>dummy</w:t>
-      </w:r>
-      <w:proofErr w:type="spellEnd"/>
-      <w:r>
-        <w:t xml:space="preserve"> wieder auf. Die Werte H3 und H5 fliegen direkt raus. Interessant ist H2: Hier gibt es noch eine zweite Vorbedingung. Da Vorbedingungen bei Werten aber logisch mit AND verknüpft werden, zieht der Dummy den kompletten Wert mit runter. Ich lösche H2 also ebenfalls komplett aus der Ziel-Architektur.</w:t>
+        <w:t>Code-Bereinigung:</w:t>
+      </w:r>
+      <w:r>
+        <w:t xml:space="preserve"> Bei Wert 02 hat früher offensichtlich jemand die Dokumentation direkt in den Code geschrieben und alte Logik auskommentiert (*). Das muss rigoros gelöscht werden, es zählt nur die aktive Zeile.</w:t>
       </w:r>
     </w:p>
     <w:p>
       <w:pPr>
         <w:numPr>
           <w:ilvl w:val="1"/>
-          <w:numId w:val="3"/>
+          <w:numId w:val="4"/>
         </w:numPr>
       </w:pPr>
       <w:r>
@@ -1042,33 +1238,25 @@
           <w:i/>
           <w:iCs/>
         </w:rPr>
-        <w:t>Redundanz-Bereinigung:</w:t>
-      </w:r>
-      <w:r>
-        <w:t xml:space="preserve"> Bei Wert H4 steht </w:t>
+        <w:t>Syntax-Update:</w:t>
+      </w:r>
+      <w:r>
+        <w:t xml:space="preserve"> Der veraltete Operator </w:t>
       </w:r>
       <w:proofErr w:type="spellStart"/>
       <w:r>
-        <w:t>Specified</w:t>
+        <w:t>ne</w:t>
       </w:r>
       <w:proofErr w:type="spellEnd"/>
       <w:r>
-        <w:t xml:space="preserve"> K40_FG_AF and K40_FG_AF = '4'. Das ist logisch betrachtet "doppelt gemoppelt". Wenn ein Merkmal den Wert '4' hat, ist es automatisch auch spezifiziert. Ich entscheide mich, diesen alten Ballast abzuwerfen und den AVC-Code schlanker zu machen, indem ich das </w:t>
-      </w:r>
-      <w:proofErr w:type="spellStart"/>
-      <w:r>
-        <w:t>Specified</w:t>
-      </w:r>
-      <w:proofErr w:type="spellEnd"/>
-      <w:r>
-        <w:t xml:space="preserve"> einfach weglasse.</w:t>
+        <w:t xml:space="preserve"> taucht in mehreren Bedingungen auf. Dieser muss zwingend in &lt;&gt; übersetzt werden.</w:t>
       </w:r>
     </w:p>
     <w:p>
       <w:pPr>
         <w:numPr>
           <w:ilvl w:val="1"/>
-          <w:numId w:val="3"/>
+          <w:numId w:val="4"/>
         </w:numPr>
       </w:pPr>
       <w:r>
@@ -1076,17 +1264,274 @@
           <w:i/>
           <w:iCs/>
         </w:rPr>
-        <w:t>Mustererkennung &amp; Tabellenbildung:</w:t>
-      </w:r>
-      <w:r>
-        <w:t xml:space="preserve"> Die Werte D1 und H1 teilen sich wieder exakt dieselbe Bedingung (K40_fst = '0'). Um den Code elegant zu halten und die Engine nicht mit IF-Statements zu überladen, packe ich diese beiden Werte in eine kleine Variantentabelle.</w:t>
+        <w:t>Struktur-Entscheidung (Redundanzen bündeln):</w:t>
+      </w:r>
+      <w:r>
+        <w:t xml:space="preserve"> Es gibt hier massive Dopplungen. Da einige Bedingungen Ungleichungen (ne bzw. &lt;&gt;) enthalten, eignen sich diese nicht optimal für klassische </w:t>
+      </w:r>
+      <w:r>
+        <w:lastRenderedPageBreak/>
+        <w:t>Variantentabellen (da Tabellen meist auf reine Gleichheit prüfen). Daher entscheide ich mich hier für einen anderen Weg der Bündelung: Ich schreibe die Restriktionen nicht einzeln pro Wert, sondern fasse die Werte im IF-Statement über Listen-Abfragen (in) zusammen. Das hält den Code ebenfalls sehr kompakt und ist für die AVC-Engine schnell auswertbar.</w:t>
+      </w:r>
+    </w:p>
+    <w:p>
+      <w:pPr>
+        <w:numPr>
+          <w:ilvl w:val="0"/>
+          <w:numId w:val="4"/>
+        </w:numPr>
+      </w:pPr>
+      <w:r>
+        <w:rPr>
+          <w:b/>
+          <w:bCs/>
+        </w:rPr>
+        <w:t>Mein erstellter AVC Ziel-Code:</w:t>
+      </w:r>
+    </w:p>
+    <w:p>
+      <w:pPr>
+        <w:rPr>
+          <w:lang w:val="en-US"/>
+        </w:rPr>
+      </w:pPr>
+      <w:r>
+        <w:rPr>
+          <w:lang w:val="en-US"/>
+        </w:rPr>
+        <w:t>Code-Snippet</w:t>
+      </w:r>
+    </w:p>
+    <w:p>
+      <w:pPr>
+        <w:rPr>
+          <w:lang w:val="en-US"/>
+        </w:rPr>
+      </w:pPr>
+      <w:r>
+        <w:rPr>
+          <w:lang w:val="en-US"/>
+        </w:rPr>
+        <w:t>RESTRICTIONS:</w:t>
+      </w:r>
+    </w:p>
+    <w:p>
+      <w:pPr>
+        <w:rPr>
+          <w:lang w:val="en-US"/>
+        </w:rPr>
+      </w:pPr>
+      <w:r>
+        <w:rPr>
+          <w:lang w:val="en-US"/>
+        </w:rPr>
+        <w:t>$self.K40_SCHP = '02' if not specified $self.K40_FG_AF,</w:t>
+      </w:r>
+    </w:p>
+    <w:p>
+      <w:pPr>
+        <w:rPr>
+          <w:lang w:val="en-US"/>
+        </w:rPr>
+      </w:pPr>
+    </w:p>
+    <w:p>
+      <w:pPr>
+        <w:rPr>
+          <w:lang w:val="en-US"/>
+        </w:rPr>
+      </w:pPr>
+      <w:r>
+        <w:rPr>
+          <w:lang w:val="en-US"/>
+        </w:rPr>
+        <w:t>$self.K40_SCHP = '06' if $self.K40_brm = '0' and $self.K40_abl = '0',</w:t>
+      </w:r>
+    </w:p>
+    <w:p>
+      <w:pPr>
+        <w:rPr>
+          <w:lang w:val="en-US"/>
+        </w:rPr>
+      </w:pPr>
+    </w:p>
+    <w:p>
+      <w:pPr>
+        <w:rPr>
+          <w:lang w:val="en-US"/>
+        </w:rPr>
+      </w:pPr>
+      <w:r>
+        <w:rPr>
+          <w:lang w:val="en-US"/>
+        </w:rPr>
+        <w:t>$self.K40_SCHP = '04' if $self.K40_ko = '09' and not specified $self.K40_ps,</w:t>
+      </w:r>
+    </w:p>
+    <w:p>
+      <w:pPr>
+        <w:rPr>
+          <w:lang w:val="en-US"/>
+        </w:rPr>
+      </w:pPr>
+    </w:p>
+    <w:p>
+      <w:pPr>
+        <w:rPr>
+          <w:lang w:val="en-US"/>
+        </w:rPr>
+      </w:pPr>
+      <w:r>
+        <w:rPr>
+          <w:lang w:val="en-US"/>
+        </w:rPr>
+        <w:t>$self.K40_SCHP in ('03', '09') if $self.K40_ko = '08' and $self.K40_abl = '0',</w:t>
+      </w:r>
+    </w:p>
+    <w:p>
+      <w:pPr>
+        <w:rPr>
+          <w:lang w:val="en-US"/>
+        </w:rPr>
+      </w:pPr>
+    </w:p>
+    <w:p>
+      <w:pPr>
+        <w:rPr>
+          <w:lang w:val="en-US"/>
+        </w:rPr>
+      </w:pPr>
+      <w:r>
+        <w:rPr>
+          <w:lang w:val="en-US"/>
+        </w:rPr>
+        <w:t>$self.K40_SCHP = '05' if $self.K40_ko = '09' and $self.K40_abl = '0',</w:t>
+      </w:r>
+    </w:p>
+    <w:p>
+      <w:pPr>
+        <w:rPr>
+          <w:lang w:val="en-US"/>
+        </w:rPr>
+      </w:pPr>
+    </w:p>
+    <w:p>
+      <w:pPr>
+        <w:rPr>
+          <w:lang w:val="en-US"/>
+        </w:rPr>
+      </w:pPr>
+      <w:r>
+        <w:rPr>
+          <w:lang w:val="en-US"/>
+        </w:rPr>
+        <w:t>$self.K40_SCHP in ('01', '10') if $self.K40_ko_af = '1' and $self.K40_ps &lt;&gt; 'pw04' and $self.K40_ps &lt;&gt; 'ps03',</w:t>
+      </w:r>
+    </w:p>
+    <w:p>
+      <w:pPr>
+        <w:rPr>
+          <w:lang w:val="en-US"/>
+        </w:rPr>
+      </w:pPr>
+    </w:p>
+    <w:p>
+      <w:pPr>
+        <w:rPr>
+          <w:lang w:val="en-US"/>
+        </w:rPr>
+      </w:pPr>
+      <w:r>
+        <w:rPr>
+          <w:lang w:val="en-US"/>
+        </w:rPr>
+        <w:t>$self.K40_SCHP in ('07', '08') if $self.K40_ko_af = '2' and $self.K40_fg_af in ('3','4') and $self.K40_ko &lt;&gt; '07'.</w:t>
+      </w:r>
+    </w:p>
+    <w:p>
+      <w:pPr>
+        <w:rPr>
+          <w:b/>
+          <w:bCs/>
+        </w:rPr>
+      </w:pPr>
+      <w:r>
+        <w:rPr>
+          <w:b/>
+          <w:bCs/>
+        </w:rPr>
+        <w:t>Artefakt 5: K40_GK_FB</w:t>
+      </w:r>
+    </w:p>
+    <w:p>
+      <w:pPr>
+        <w:numPr>
+          <w:ilvl w:val="0"/>
+          <w:numId w:val="5"/>
+        </w:numPr>
+      </w:pPr>
+      <w:r>
+        <w:rPr>
+          <w:b/>
+          <w:bCs/>
+        </w:rPr>
+        <w:t>Ausgangslage (LO-VC Input / Rohdaten):</w:t>
       </w:r>
     </w:p>
     <w:p>
       <w:pPr>
         <w:numPr>
           <w:ilvl w:val="1"/>
-          <w:numId w:val="3"/>
+          <w:numId w:val="5"/>
+        </w:numPr>
+      </w:pPr>
+      <w:r>
+        <w:t>Merkmalsname: K40_GK_FB (Char) mit insgesamt 10 Werten (Farb- bzw. Strukturcodes wie 1018, 3000, 2004 etc.).</w:t>
+      </w:r>
+    </w:p>
+    <w:p>
+      <w:pPr>
+        <w:numPr>
+          <w:ilvl w:val="1"/>
+          <w:numId w:val="5"/>
+        </w:numPr>
+      </w:pPr>
+      <w:r>
+        <w:t>Besonderheit: Die ersten 7 Werte (1018, 3000, 5002, 5003, 6024, 2002, 7016) haben alle exakt dieselbe Vorbedingung hinterlegt: V_TW0228 mit der Syntax K40_grh_af ne '3'.</w:t>
+      </w:r>
+    </w:p>
+    <w:p>
+      <w:pPr>
+        <w:numPr>
+          <w:ilvl w:val="1"/>
+          <w:numId w:val="5"/>
+        </w:numPr>
+      </w:pPr>
+      <w:r>
+        <w:t>Die verbleibenden 3 Werte (2004, 7032, 7035) besitzen überhaupt keine Vorbedingungen.</w:t>
+      </w:r>
+    </w:p>
+    <w:p>
+      <w:pPr>
+        <w:numPr>
+          <w:ilvl w:val="0"/>
+          <w:numId w:val="5"/>
+        </w:numPr>
+      </w:pPr>
+      <w:r>
+        <w:rPr>
+          <w:b/>
+          <w:bCs/>
+        </w:rPr>
+        <w:lastRenderedPageBreak/>
+        <w:t>Meine Analyse &amp; Gedankengänge bei der Migration:</w:t>
+      </w:r>
+    </w:p>
+    <w:p>
+      <w:pPr>
+        <w:numPr>
+          <w:ilvl w:val="1"/>
+          <w:numId w:val="5"/>
         </w:numPr>
       </w:pPr>
       <w:r>
@@ -1094,17 +1539,63 @@
           <w:i/>
           <w:iCs/>
         </w:rPr>
-        <w:t>Wert ohne Bedingung:</w:t>
-      </w:r>
-      <w:r>
-        <w:t xml:space="preserve"> Da D2 keine Bedingung hat, muss ich dafür keinen Code generieren. Er ist einfach immer erlaubt.</w:t>
+        <w:t>Mustererkennung &amp; Redundanz:</w:t>
+      </w:r>
+      <w:r>
+        <w:t xml:space="preserve"> Das ist ein klassisches Beispiel für ineffiziente Datenpflege im Altsystem. Anstatt die Bedingung einmal zentral abzuprüfen, wurde sie an 7 verschiedene Einzelwerte gehängt.</w:t>
+      </w:r>
+    </w:p>
+    <w:p>
+      <w:pPr>
+        <w:numPr>
+          <w:ilvl w:val="1"/>
+          <w:numId w:val="5"/>
+        </w:numPr>
+      </w:pPr>
+      <w:r>
+        <w:rPr>
+          <w:i/>
+          <w:iCs/>
+        </w:rPr>
+        <w:t>Struktur-Entscheidung (Architektur-Wahl):</w:t>
+      </w:r>
+      <w:r>
+        <w:t xml:space="preserve"> Wenn ich das 1:1 in AVC übersetze, müsste ich ein IF-Statement mit einer langen Liste (IN ('1018', '3000', ... )) schreiben. Da es hier aber ausschließlich um eine einfache Bedingung mit einer Ungleichung (ne) geht und die anderen drei Werte ohnehin immer gelten, entscheide ich mich für eine elegantere Logik-Umkehr. Anstatt positiv aufzulisten, welche 7 Werte bei &lt;&gt; '3' erlaubt sind, schreibe ich ein Constraint, das definiert, was passiert, wenn der Wert </w:t>
+      </w:r>
+      <w:r>
+        <w:rPr>
+          <w:i/>
+          <w:iCs/>
+        </w:rPr>
+        <w:t>doch</w:t>
+      </w:r>
+      <w:r>
+        <w:t xml:space="preserve"> '3' ist (dann sind eben nur noch die drei freien Werte erlaubt).</w:t>
+      </w:r>
+    </w:p>
+    <w:p>
+      <w:pPr>
+        <w:numPr>
+          <w:ilvl w:val="1"/>
+          <w:numId w:val="5"/>
+        </w:numPr>
+      </w:pPr>
+      <w:r>
+        <w:rPr>
+          <w:i/>
+          <w:iCs/>
+        </w:rPr>
+        <w:t>Syntax-Update:</w:t>
+      </w:r>
+      <w:r>
+        <w:t xml:space="preserve"> Der Operator ne wird in AVC durch &lt;&gt; ersetzt.</w:t>
       </w:r>
     </w:p>
     <w:p>
       <w:pPr>
         <w:numPr>
           <w:ilvl w:val="0"/>
-          <w:numId w:val="3"/>
+          <w:numId w:val="5"/>
         </w:numPr>
       </w:pPr>
       <w:r>
@@ -1112,23 +1603,7 @@
           <w:b/>
           <w:bCs/>
         </w:rPr>
-        <w:t xml:space="preserve">Mein erstellter </w:t>
-      </w:r>
-      <w:proofErr w:type="gramStart"/>
-      <w:r>
-        <w:rPr>
-          <w:b/>
-          <w:bCs/>
-        </w:rPr>
-        <w:t>AVC Ziel</w:t>
-      </w:r>
-      <w:proofErr w:type="gramEnd"/>
-      <w:r>
-        <w:rPr>
-          <w:b/>
-          <w:bCs/>
-        </w:rPr>
-        <w:t>-Code:</w:t>
+        <w:t>Mein erstellter AVC Ziel-Code:</w:t>
       </w:r>
     </w:p>
     <w:p>
@@ -1167,930 +1642,7 @@
         <w:rPr>
           <w:lang w:val="en-US"/>
         </w:rPr>
-        <w:t>table K40_PL_01 (</w:t>
-      </w:r>
-    </w:p>
-    <w:p>
-      <w:pPr>
-        <w:rPr>
-          <w:lang w:val="en-US"/>
-        </w:rPr>
-      </w:pPr>
-      <w:r>
-        <w:rPr>
-          <w:lang w:val="en-US"/>
-        </w:rPr>
-        <w:lastRenderedPageBreak/>
-        <w:t xml:space="preserve">    K40_fst = $</w:t>
-      </w:r>
-      <w:proofErr w:type="gramStart"/>
-      <w:r>
-        <w:rPr>
-          <w:lang w:val="en-US"/>
-        </w:rPr>
-        <w:t>self.K</w:t>
-      </w:r>
-      <w:proofErr w:type="gramEnd"/>
-      <w:r>
-        <w:rPr>
-          <w:lang w:val="en-US"/>
-        </w:rPr>
-        <w:t>40_fst,</w:t>
-      </w:r>
-    </w:p>
-    <w:p>
-      <w:pPr>
-        <w:rPr>
-          <w:lang w:val="en-US"/>
-        </w:rPr>
-      </w:pPr>
-      <w:r>
-        <w:rPr>
-          <w:lang w:val="en-US"/>
-        </w:rPr>
-        <w:t xml:space="preserve">    K40_PL = $</w:t>
-      </w:r>
-      <w:proofErr w:type="gramStart"/>
-      <w:r>
-        <w:rPr>
-          <w:lang w:val="en-US"/>
-        </w:rPr>
-        <w:t>self.K</w:t>
-      </w:r>
-      <w:proofErr w:type="gramEnd"/>
-      <w:r>
-        <w:rPr>
-          <w:lang w:val="en-US"/>
-        </w:rPr>
-        <w:t>40_PL</w:t>
-      </w:r>
-    </w:p>
-    <w:p>
-      <w:pPr>
-        <w:rPr>
-          <w:lang w:val="en-US"/>
-        </w:rPr>
-      </w:pPr>
-      <w:r>
-        <w:rPr>
-          <w:lang w:val="en-US"/>
-        </w:rPr>
-        <w:t>),</w:t>
-      </w:r>
-    </w:p>
-    <w:p>
-      <w:pPr>
-        <w:rPr>
-          <w:lang w:val="en-US"/>
-        </w:rPr>
-      </w:pPr>
-      <w:r>
-        <w:rPr>
-          <w:lang w:val="en-US"/>
-        </w:rPr>
-        <w:t>$</w:t>
-      </w:r>
-      <w:proofErr w:type="gramStart"/>
-      <w:r>
-        <w:rPr>
-          <w:lang w:val="en-US"/>
-        </w:rPr>
-        <w:t>self.K</w:t>
-      </w:r>
-      <w:proofErr w:type="gramEnd"/>
-      <w:r>
-        <w:rPr>
-          <w:lang w:val="en-US"/>
-        </w:rPr>
-        <w:t>40_PL = 'H4' if $self.K40_FG_AF = '4'.</w:t>
-      </w:r>
-    </w:p>
-    <w:p>
-      <w:pPr>
-        <w:numPr>
-          <w:ilvl w:val="0"/>
-          <w:numId w:val="3"/>
-        </w:numPr>
-      </w:pPr>
-      <w:r>
-        <w:rPr>
-          <w:b/>
-          <w:bCs/>
-        </w:rPr>
-        <w:t>Meine Tabellen hierzu:</w:t>
-      </w:r>
-    </w:p>
-    <w:p>
-      <w:pPr>
-        <w:numPr>
-          <w:ilvl w:val="1"/>
-          <w:numId w:val="3"/>
-        </w:numPr>
-      </w:pPr>
-      <w:r>
-        <w:rPr>
-          <w:b/>
-          <w:bCs/>
-        </w:rPr>
-        <w:t>Tabelle 1 (K40_PL_01):</w:t>
-      </w:r>
-    </w:p>
-    <w:p>
-      <w:pPr>
-        <w:numPr>
-          <w:ilvl w:val="2"/>
-          <w:numId w:val="3"/>
-        </w:numPr>
-      </w:pPr>
-      <w:r>
-        <w:t>Spalten: K40_fst, K40_PL</w:t>
-      </w:r>
-    </w:p>
-    <w:p>
-      <w:pPr>
-        <w:numPr>
-          <w:ilvl w:val="2"/>
-          <w:numId w:val="3"/>
-        </w:numPr>
-      </w:pPr>
-      <w:r>
-        <w:t>Zeilen: 0, D1; 0, H1</w:t>
-      </w:r>
-    </w:p>
-    <w:p>
-      <w:pPr>
-        <w:rPr>
-          <w:b/>
-          <w:bCs/>
-        </w:rPr>
-      </w:pPr>
-      <w:r>
-        <w:rPr>
-          <w:b/>
-          <w:bCs/>
-        </w:rPr>
-        <w:t>Artefakt 4: K40_SCHP</w:t>
-      </w:r>
-    </w:p>
-    <w:p>
-      <w:pPr>
-        <w:numPr>
-          <w:ilvl w:val="0"/>
-          <w:numId w:val="4"/>
-        </w:numPr>
-      </w:pPr>
-      <w:r>
-        <w:rPr>
-          <w:b/>
-          <w:bCs/>
-        </w:rPr>
-        <w:t>Ausgangslage (LO-VC Input / Rohdaten):</w:t>
-      </w:r>
-    </w:p>
-    <w:p>
-      <w:pPr>
-        <w:numPr>
-          <w:ilvl w:val="1"/>
-          <w:numId w:val="4"/>
-        </w:numPr>
-      </w:pPr>
-      <w:r>
-        <w:t>Merkmalsname: K40_SCHP (Char) mit den Werten 01 bis 10.</w:t>
-      </w:r>
-    </w:p>
-    <w:p>
-      <w:pPr>
-        <w:numPr>
-          <w:ilvl w:val="1"/>
-          <w:numId w:val="4"/>
-        </w:numPr>
-      </w:pPr>
-      <w:r>
-        <w:t>Besonderheiten bei den Vorbedingungen:</w:t>
-      </w:r>
-    </w:p>
-    <w:p>
-      <w:pPr>
-        <w:numPr>
-          <w:ilvl w:val="2"/>
-          <w:numId w:val="4"/>
-        </w:numPr>
-      </w:pPr>
-      <w:r>
-        <w:t xml:space="preserve">Wert 02: Enthält einen großen Block an auskommentiertem Freitext (z. B. *Merkmalswert ausgeblendet) und nur eine aktive Zeile (not </w:t>
-      </w:r>
-      <w:proofErr w:type="spellStart"/>
-      <w:r>
-        <w:t>specified</w:t>
-      </w:r>
-      <w:proofErr w:type="spellEnd"/>
-      <w:r>
-        <w:t xml:space="preserve"> K40_FG_AF).</w:t>
-      </w:r>
-    </w:p>
-    <w:p>
-      <w:pPr>
-        <w:numPr>
-          <w:ilvl w:val="2"/>
-          <w:numId w:val="4"/>
-        </w:numPr>
-      </w:pPr>
-      <w:r>
-        <w:t>Werte 01 und 10: Haben exakt dieselbe Bedingung (K40_ko_af = '1' and K40_ps ne 'pw04' and K40_ps ne 'ps03').</w:t>
-      </w:r>
-    </w:p>
-    <w:p>
-      <w:pPr>
-        <w:numPr>
-          <w:ilvl w:val="2"/>
-          <w:numId w:val="4"/>
-        </w:numPr>
-      </w:pPr>
-      <w:r>
-        <w:t>Werte 07 und 08: Haben exakt dieselbe Bedingung (K40_ko_af = '2' and K40_fg_af in ('3','4') and K40_ko ne '07').</w:t>
-      </w:r>
-    </w:p>
-    <w:p>
-      <w:pPr>
-        <w:numPr>
-          <w:ilvl w:val="2"/>
-          <w:numId w:val="4"/>
-        </w:numPr>
-      </w:pPr>
-      <w:r>
-        <w:t>Werte 03 und 09: Haben exakt dieselbe Bedingung (K40_ko = '08' and K40_abl = '0').</w:t>
-      </w:r>
-    </w:p>
-    <w:p>
-      <w:pPr>
-        <w:numPr>
-          <w:ilvl w:val="2"/>
-          <w:numId w:val="4"/>
-        </w:numPr>
-      </w:pPr>
-      <w:r>
-        <w:t>Wert 05: Ähnelt 03/09, prüft aber auf K40_ko = '09'.</w:t>
-      </w:r>
-    </w:p>
-    <w:p>
-      <w:pPr>
-        <w:numPr>
-          <w:ilvl w:val="0"/>
-          <w:numId w:val="4"/>
-        </w:numPr>
-      </w:pPr>
-      <w:r>
-        <w:rPr>
-          <w:b/>
-          <w:bCs/>
-        </w:rPr>
-        <w:t>Meine Analyse &amp; Gedankengänge bei der Migration:</w:t>
-      </w:r>
-    </w:p>
-    <w:p>
-      <w:pPr>
-        <w:numPr>
-          <w:ilvl w:val="1"/>
-          <w:numId w:val="4"/>
-        </w:numPr>
-      </w:pPr>
-      <w:r>
-        <w:rPr>
-          <w:i/>
-          <w:iCs/>
-        </w:rPr>
-        <w:t>Code-Bereinigung:</w:t>
-      </w:r>
-      <w:r>
-        <w:t xml:space="preserve"> Bei Wert 02 hat früher offensichtlich jemand die Dokumentation direkt in den Code geschrieben und alte Logik auskommentiert (*). Das muss rigoros gelöscht werden, es zählt nur die aktive Zeile.</w:t>
-      </w:r>
-    </w:p>
-    <w:p>
-      <w:pPr>
-        <w:numPr>
-          <w:ilvl w:val="1"/>
-          <w:numId w:val="4"/>
-        </w:numPr>
-      </w:pPr>
-      <w:r>
-        <w:rPr>
-          <w:i/>
-          <w:iCs/>
-        </w:rPr>
-        <w:t>Syntax-Update:</w:t>
-      </w:r>
-      <w:r>
-        <w:t xml:space="preserve"> Der veraltete Operator </w:t>
-      </w:r>
-      <w:proofErr w:type="spellStart"/>
-      <w:r>
-        <w:t>ne</w:t>
-      </w:r>
-      <w:proofErr w:type="spellEnd"/>
-      <w:r>
-        <w:t xml:space="preserve"> taucht in mehreren Bedingungen auf. Dieser muss zwingend in &lt;&gt; übersetzt werden.</w:t>
-      </w:r>
-    </w:p>
-    <w:p>
-      <w:pPr>
-        <w:numPr>
-          <w:ilvl w:val="1"/>
-          <w:numId w:val="4"/>
-        </w:numPr>
-      </w:pPr>
-      <w:r>
-        <w:rPr>
-          <w:i/>
-          <w:iCs/>
-        </w:rPr>
-        <w:t>Struktur-Entscheidung (Redundanzen bündeln):</w:t>
-      </w:r>
-      <w:r>
-        <w:t xml:space="preserve"> Es gibt hier massive Dopplungen. Da einige Bedingungen Ungleichungen (ne bzw. &lt;&gt;) enthalten, eignen sich diese nicht optimal für klassische </w:t>
-      </w:r>
-      <w:r>
-        <w:lastRenderedPageBreak/>
-        <w:t>Variantentabellen (da Tabellen meist auf reine Gleichheit prüfen). Daher entscheide ich mich hier für einen anderen Weg der Bündelung: Ich schreibe die Restriktionen nicht einzeln pro Wert, sondern fasse die Werte im IF-Statement über Listen-Abfragen (in) zusammen. Das hält den Code ebenfalls sehr kompakt und ist für die AVC-Engine schnell auswertbar.</w:t>
-      </w:r>
-    </w:p>
-    <w:p>
-      <w:pPr>
-        <w:numPr>
-          <w:ilvl w:val="0"/>
-          <w:numId w:val="4"/>
-        </w:numPr>
-      </w:pPr>
-      <w:r>
-        <w:rPr>
-          <w:b/>
-          <w:bCs/>
-        </w:rPr>
-        <w:t xml:space="preserve">Mein erstellter </w:t>
-      </w:r>
-      <w:proofErr w:type="gramStart"/>
-      <w:r>
-        <w:rPr>
-          <w:b/>
-          <w:bCs/>
-        </w:rPr>
-        <w:t>AVC Ziel</w:t>
-      </w:r>
-      <w:proofErr w:type="gramEnd"/>
-      <w:r>
-        <w:rPr>
-          <w:b/>
-          <w:bCs/>
-        </w:rPr>
-        <w:t>-Code:</w:t>
-      </w:r>
-    </w:p>
-    <w:p>
-      <w:pPr>
-        <w:rPr>
-          <w:lang w:val="en-US"/>
-        </w:rPr>
-      </w:pPr>
-      <w:r>
-        <w:rPr>
-          <w:lang w:val="en-US"/>
-        </w:rPr>
-        <w:t>Code-Snippet</w:t>
-      </w:r>
-    </w:p>
-    <w:p>
-      <w:pPr>
-        <w:rPr>
-          <w:lang w:val="en-US"/>
-        </w:rPr>
-      </w:pPr>
-      <w:r>
-        <w:rPr>
-          <w:lang w:val="en-US"/>
-        </w:rPr>
-        <w:t>RESTRICTIONS:</w:t>
-      </w:r>
-    </w:p>
-    <w:p>
-      <w:pPr>
-        <w:rPr>
-          <w:lang w:val="en-US"/>
-        </w:rPr>
-      </w:pPr>
-      <w:r>
-        <w:rPr>
-          <w:lang w:val="en-US"/>
-        </w:rPr>
-        <w:t>$</w:t>
-      </w:r>
-      <w:proofErr w:type="gramStart"/>
-      <w:r>
-        <w:rPr>
-          <w:lang w:val="en-US"/>
-        </w:rPr>
-        <w:t>self.K</w:t>
-      </w:r>
-      <w:proofErr w:type="gramEnd"/>
-      <w:r>
-        <w:rPr>
-          <w:lang w:val="en-US"/>
-        </w:rPr>
-        <w:t>40_SCHP = '02' if not specified $self.K40_FG_AF,</w:t>
-      </w:r>
-    </w:p>
-    <w:p>
-      <w:pPr>
-        <w:rPr>
-          <w:lang w:val="en-US"/>
-        </w:rPr>
-      </w:pPr>
-    </w:p>
-    <w:p>
-      <w:pPr>
-        <w:rPr>
-          <w:lang w:val="en-US"/>
-        </w:rPr>
-      </w:pPr>
-      <w:r>
-        <w:rPr>
-          <w:lang w:val="en-US"/>
-        </w:rPr>
-        <w:t>$</w:t>
-      </w:r>
-      <w:proofErr w:type="gramStart"/>
-      <w:r>
-        <w:rPr>
-          <w:lang w:val="en-US"/>
-        </w:rPr>
-        <w:t>self.K</w:t>
-      </w:r>
-      <w:proofErr w:type="gramEnd"/>
-      <w:r>
-        <w:rPr>
-          <w:lang w:val="en-US"/>
-        </w:rPr>
-        <w:t>40_SCHP = '06' if $self.K40_brm = '0' and $self.K40_abl = '0',</w:t>
-      </w:r>
-    </w:p>
-    <w:p>
-      <w:pPr>
-        <w:rPr>
-          <w:lang w:val="en-US"/>
-        </w:rPr>
-      </w:pPr>
-    </w:p>
-    <w:p>
-      <w:pPr>
-        <w:rPr>
-          <w:lang w:val="en-US"/>
-        </w:rPr>
-      </w:pPr>
-      <w:r>
-        <w:rPr>
-          <w:lang w:val="en-US"/>
-        </w:rPr>
-        <w:t>$</w:t>
-      </w:r>
-      <w:proofErr w:type="gramStart"/>
-      <w:r>
-        <w:rPr>
-          <w:lang w:val="en-US"/>
-        </w:rPr>
-        <w:t>self.K</w:t>
-      </w:r>
-      <w:proofErr w:type="gramEnd"/>
-      <w:r>
-        <w:rPr>
-          <w:lang w:val="en-US"/>
-        </w:rPr>
-        <w:t>40_SCHP = '04' if $self.K40_ko = '09' and not specified $self.K40_ps,</w:t>
-      </w:r>
-    </w:p>
-    <w:p>
-      <w:pPr>
-        <w:rPr>
-          <w:lang w:val="en-US"/>
-        </w:rPr>
-      </w:pPr>
-    </w:p>
-    <w:p>
-      <w:pPr>
-        <w:rPr>
-          <w:lang w:val="en-US"/>
-        </w:rPr>
-      </w:pPr>
-      <w:r>
-        <w:rPr>
-          <w:lang w:val="en-US"/>
-        </w:rPr>
-        <w:t>$</w:t>
-      </w:r>
-      <w:proofErr w:type="gramStart"/>
-      <w:r>
-        <w:rPr>
-          <w:lang w:val="en-US"/>
-        </w:rPr>
-        <w:t>self.K</w:t>
-      </w:r>
-      <w:proofErr w:type="gramEnd"/>
-      <w:r>
-        <w:rPr>
-          <w:lang w:val="en-US"/>
-        </w:rPr>
-        <w:t>40_SCHP in ('03', '09') if $self.K40_ko = '08' and $self.K40_abl = '0',</w:t>
-      </w:r>
-    </w:p>
-    <w:p>
-      <w:pPr>
-        <w:rPr>
-          <w:lang w:val="en-US"/>
-        </w:rPr>
-      </w:pPr>
-    </w:p>
-    <w:p>
-      <w:pPr>
-        <w:rPr>
-          <w:lang w:val="en-US"/>
-        </w:rPr>
-      </w:pPr>
-      <w:r>
-        <w:rPr>
-          <w:lang w:val="en-US"/>
-        </w:rPr>
-        <w:t>$</w:t>
-      </w:r>
-      <w:proofErr w:type="gramStart"/>
-      <w:r>
-        <w:rPr>
-          <w:lang w:val="en-US"/>
-        </w:rPr>
-        <w:t>self.K</w:t>
-      </w:r>
-      <w:proofErr w:type="gramEnd"/>
-      <w:r>
-        <w:rPr>
-          <w:lang w:val="en-US"/>
-        </w:rPr>
-        <w:t>40_SCHP = '05' if $self.K40_ko = '09' and $self.K40_abl = '0',</w:t>
-      </w:r>
-    </w:p>
-    <w:p>
-      <w:pPr>
-        <w:rPr>
-          <w:lang w:val="en-US"/>
-        </w:rPr>
-      </w:pPr>
-    </w:p>
-    <w:p>
-      <w:pPr>
-        <w:rPr>
-          <w:lang w:val="en-US"/>
-        </w:rPr>
-      </w:pPr>
-      <w:r>
-        <w:rPr>
-          <w:lang w:val="en-US"/>
-        </w:rPr>
-        <w:t>$</w:t>
-      </w:r>
-      <w:proofErr w:type="gramStart"/>
-      <w:r>
-        <w:rPr>
-          <w:lang w:val="en-US"/>
-        </w:rPr>
-        <w:t>self.K</w:t>
-      </w:r>
-      <w:proofErr w:type="gramEnd"/>
-      <w:r>
-        <w:rPr>
-          <w:lang w:val="en-US"/>
-        </w:rPr>
-        <w:t>40_SCHP in ('01', '10') if $self.K40_ko_af = '1' and $self.K40_ps &lt;&gt; 'pw04' and $self.K40_ps &lt;&gt; 'ps03',</w:t>
-      </w:r>
-    </w:p>
-    <w:p>
-      <w:pPr>
-        <w:rPr>
-          <w:lang w:val="en-US"/>
-        </w:rPr>
-      </w:pPr>
-    </w:p>
-    <w:p>
-      <w:pPr>
-        <w:rPr>
-          <w:lang w:val="en-US"/>
-        </w:rPr>
-      </w:pPr>
-      <w:r>
-        <w:rPr>
-          <w:lang w:val="en-US"/>
-        </w:rPr>
-        <w:t>$</w:t>
-      </w:r>
-      <w:proofErr w:type="gramStart"/>
-      <w:r>
-        <w:rPr>
-          <w:lang w:val="en-US"/>
-        </w:rPr>
-        <w:t>self.K</w:t>
-      </w:r>
-      <w:proofErr w:type="gramEnd"/>
-      <w:r>
-        <w:rPr>
-          <w:lang w:val="en-US"/>
-        </w:rPr>
-        <w:t>40_SCHP in ('07', '08') if $self.K40_ko_af = '2' and $self.K40_fg_af in ('3','4') and $self.K40_ko &lt;&gt; '07'.</w:t>
-      </w:r>
-    </w:p>
-    <w:p>
-      <w:r>
-        <w:rPr>
-          <w:b/>
-          <w:bCs/>
-        </w:rPr>
-        <w:t>Kurzer Check dazu:</w:t>
-      </w:r>
-      <w:r>
-        <w:t xml:space="preserve"> Die Entscheidung, hier </w:t>
-      </w:r>
-      <w:r>
-        <w:rPr>
-          <w:i/>
-          <w:iCs/>
-        </w:rPr>
-        <w:t>keine</w:t>
-      </w:r>
-      <w:r>
-        <w:t xml:space="preserve"> Tabellen zu nutzen, sondern die Werte via in ('01', '10') zu bündeln, ist methodisch </w:t>
-      </w:r>
-      <w:proofErr w:type="gramStart"/>
-      <w:r>
-        <w:t>extrem wertvoll</w:t>
-      </w:r>
-      <w:proofErr w:type="gramEnd"/>
-      <w:r>
-        <w:t>! Das zeigt später in deiner Arbeit, dass dein Architekturen-Modell flexibel sein muss (</w:t>
-      </w:r>
-      <w:proofErr w:type="gramStart"/>
-      <w:r>
-        <w:t>also</w:t>
-      </w:r>
-      <w:proofErr w:type="gramEnd"/>
-      <w:r>
-        <w:t xml:space="preserve"> dass der Agent entscheiden muss: </w:t>
-      </w:r>
-      <w:r>
-        <w:rPr>
-          <w:i/>
-          <w:iCs/>
-        </w:rPr>
-        <w:t>Tabelle vs. gebündeltes IF</w:t>
-      </w:r>
-      <w:r>
-        <w:t>).</w:t>
-      </w:r>
-    </w:p>
-    <w:p>
-      <w:pPr>
-        <w:rPr>
-          <w:b/>
-          <w:bCs/>
-        </w:rPr>
-      </w:pPr>
-      <w:r>
-        <w:rPr>
-          <w:b/>
-          <w:bCs/>
-        </w:rPr>
-        <w:t>Artefakt 5: K40_GK_FB</w:t>
-      </w:r>
-    </w:p>
-    <w:p>
-      <w:pPr>
-        <w:numPr>
-          <w:ilvl w:val="0"/>
-          <w:numId w:val="5"/>
-        </w:numPr>
-      </w:pPr>
-      <w:r>
-        <w:rPr>
-          <w:b/>
-          <w:bCs/>
-        </w:rPr>
-        <w:t>Ausgangslage (LO-VC Input / Rohdaten):</w:t>
-      </w:r>
-    </w:p>
-    <w:p>
-      <w:pPr>
-        <w:numPr>
-          <w:ilvl w:val="1"/>
-          <w:numId w:val="5"/>
-        </w:numPr>
-      </w:pPr>
-      <w:r>
-        <w:t>Merkmalsname: K40_GK_FB (Char) mit insgesamt 10 Werten (Farb- bzw. Strukturcodes wie 1018, 3000, 2004 etc.).</w:t>
-      </w:r>
-    </w:p>
-    <w:p>
-      <w:pPr>
-        <w:numPr>
-          <w:ilvl w:val="1"/>
-          <w:numId w:val="5"/>
-        </w:numPr>
-      </w:pPr>
-      <w:r>
-        <w:lastRenderedPageBreak/>
-        <w:t>Besonderheit: Die ersten 7 Werte (1018, 3000, 5002, 5003, 6024, 2002, 7016) haben alle exakt dieselbe Vorbedingung hinterlegt: V_TW0228 mit der Syntax K40_grh_af ne '3'.</w:t>
-      </w:r>
-    </w:p>
-    <w:p>
-      <w:pPr>
-        <w:numPr>
-          <w:ilvl w:val="1"/>
-          <w:numId w:val="5"/>
-        </w:numPr>
-      </w:pPr>
-      <w:r>
-        <w:t>Die verbleibenden 3 Werte (2004, 7032, 7035) besitzen überhaupt keine Vorbedingungen.</w:t>
-      </w:r>
-    </w:p>
-    <w:p>
-      <w:pPr>
-        <w:numPr>
-          <w:ilvl w:val="0"/>
-          <w:numId w:val="5"/>
-        </w:numPr>
-      </w:pPr>
-      <w:r>
-        <w:rPr>
-          <w:b/>
-          <w:bCs/>
-        </w:rPr>
-        <w:t>Meine Analyse &amp; Gedankengänge bei der Migration:</w:t>
-      </w:r>
-    </w:p>
-    <w:p>
-      <w:pPr>
-        <w:numPr>
-          <w:ilvl w:val="1"/>
-          <w:numId w:val="5"/>
-        </w:numPr>
-      </w:pPr>
-      <w:r>
-        <w:rPr>
-          <w:i/>
-          <w:iCs/>
-        </w:rPr>
-        <w:t>Mustererkennung &amp; Redundanz:</w:t>
-      </w:r>
-      <w:r>
-        <w:t xml:space="preserve"> Das ist ein klassisches Beispiel für ineffiziente Datenpflege im Altsystem. Anstatt die Bedingung einmal zentral abzuprüfen, wurde sie an 7 verschiedene Einzelwerte gehängt.</w:t>
-      </w:r>
-    </w:p>
-    <w:p>
-      <w:pPr>
-        <w:numPr>
-          <w:ilvl w:val="1"/>
-          <w:numId w:val="5"/>
-        </w:numPr>
-      </w:pPr>
-      <w:r>
-        <w:rPr>
-          <w:i/>
-          <w:iCs/>
-        </w:rPr>
-        <w:t>Struktur-Entscheidung (Architektur-Wahl):</w:t>
-      </w:r>
-      <w:r>
-        <w:t xml:space="preserve"> Wenn ich das 1:1 in AVC übersetze, müsste ich ein IF-Statement mit einer langen Liste (IN ('1018', '3000', </w:t>
-      </w:r>
-      <w:proofErr w:type="gramStart"/>
-      <w:r>
-        <w:t>... )</w:t>
-      </w:r>
-      <w:proofErr w:type="gramEnd"/>
-      <w:r>
-        <w:t xml:space="preserve">) schreiben. Da es hier aber ausschließlich um eine einfache Bedingung mit einer Ungleichung (ne) geht und die anderen drei Werte ohnehin immer gelten, entscheide ich mich für eine elegantere Logik-Umkehr. Anstatt positiv aufzulisten, welche 7 Werte bei &lt;&gt; '3' erlaubt sind, schreibe ich ein Constraint, das definiert, was passiert, wenn der Wert </w:t>
-      </w:r>
-      <w:r>
-        <w:rPr>
-          <w:i/>
-          <w:iCs/>
-        </w:rPr>
-        <w:t>doch</w:t>
-      </w:r>
-      <w:r>
-        <w:t xml:space="preserve"> '3' ist (dann sind eben nur noch die drei freien Werte erlaubt).</w:t>
-      </w:r>
-    </w:p>
-    <w:p>
-      <w:pPr>
-        <w:numPr>
-          <w:ilvl w:val="1"/>
-          <w:numId w:val="5"/>
-        </w:numPr>
-      </w:pPr>
-      <w:r>
-        <w:rPr>
-          <w:i/>
-          <w:iCs/>
-        </w:rPr>
-        <w:t>Syntax-Update:</w:t>
-      </w:r>
-      <w:r>
-        <w:t xml:space="preserve"> Der Operator ne wird in AVC durch &lt;&gt; ersetzt.</w:t>
-      </w:r>
-    </w:p>
-    <w:p>
-      <w:pPr>
-        <w:numPr>
-          <w:ilvl w:val="0"/>
-          <w:numId w:val="5"/>
-        </w:numPr>
-      </w:pPr>
-      <w:r>
-        <w:rPr>
-          <w:b/>
-          <w:bCs/>
-        </w:rPr>
-        <w:t xml:space="preserve">Mein erstellter </w:t>
-      </w:r>
-      <w:proofErr w:type="gramStart"/>
-      <w:r>
-        <w:rPr>
-          <w:b/>
-          <w:bCs/>
-        </w:rPr>
-        <w:t>AVC Ziel</w:t>
-      </w:r>
-      <w:proofErr w:type="gramEnd"/>
-      <w:r>
-        <w:rPr>
-          <w:b/>
-          <w:bCs/>
-        </w:rPr>
-        <w:t>-Code:</w:t>
-      </w:r>
-    </w:p>
-    <w:p>
-      <w:pPr>
-        <w:rPr>
-          <w:lang w:val="en-US"/>
-        </w:rPr>
-      </w:pPr>
-      <w:r>
-        <w:rPr>
-          <w:lang w:val="en-US"/>
-        </w:rPr>
-        <w:t>Code-Snippet</w:t>
-      </w:r>
-    </w:p>
-    <w:p>
-      <w:pPr>
-        <w:rPr>
-          <w:lang w:val="en-US"/>
-        </w:rPr>
-      </w:pPr>
-      <w:r>
-        <w:rPr>
-          <w:lang w:val="en-US"/>
-        </w:rPr>
-        <w:t>RESTRICTIONS:</w:t>
-      </w:r>
-    </w:p>
-    <w:p>
-      <w:pPr>
-        <w:rPr>
-          <w:lang w:val="en-US"/>
-        </w:rPr>
-      </w:pPr>
-      <w:r>
-        <w:rPr>
-          <w:lang w:val="en-US"/>
-        </w:rPr>
-        <w:t>$</w:t>
-      </w:r>
-      <w:proofErr w:type="gramStart"/>
-      <w:r>
-        <w:rPr>
-          <w:lang w:val="en-US"/>
-        </w:rPr>
-        <w:t>self.K</w:t>
-      </w:r>
-      <w:proofErr w:type="gramEnd"/>
-      <w:r>
-        <w:rPr>
-          <w:lang w:val="en-US"/>
-        </w:rPr>
-        <w:t>40_GK_FB in ('2004', '7032', '7035') if $self.K40_grh_af = '3'.</w:t>
-      </w:r>
-    </w:p>
-    <w:p>
-      <w:r>
-        <w:rPr>
-          <w:i/>
-          <w:iCs/>
-        </w:rPr>
-        <w:t>(Anmerkung: Das bedeutet logisch exakt dasselbe wie die alte Struktur. Wenn die Bedingung NICHT '3' ist, gilt diese Einschränkung nicht, und somit sind alle 10 Werte auswahloffen).</w:t>
+        <w:t>$self.K40_GK_FB in ('2004', '7032', '7035') if $self.K40_grh_af = '3'.</w:t>
       </w:r>
     </w:p>
     <w:p/>
@@ -3473,6 +3025,7 @@
   <w:style w:type="character" w:default="1" w:styleId="Absatz-Standardschriftart">
     <w:name w:val="Default Paragraph Font"/>
     <w:uiPriority w:val="1"/>
+    <w:semiHidden/>
     <w:unhideWhenUsed/>
   </w:style>
   <w:style w:type="table" w:default="1" w:styleId="NormaleTabelle">

</xml_diff>